<commit_message>
feat: week05 - Responsive UI (Navbar, Cards, Row/Col Grid system)
</commit_message>
<xml_diff>
--- a/Week05/Week05_BaoCaoNhom.docx
+++ b/Week05/Week05_BaoCaoNhom.docx
@@ -188,18 +188,8 @@
             </w:tcMar>
           </w:tcPr>
           <w:p>
-            <w:pPr>
-              <w:jc w:val="left"/>
-            </w:pPr>
-            <w:r>
-              <w:rPr>
-                <w:rFonts w:ascii="Times New Roman" w:cs="Times New Roman" w:eastAsia="Times New Roman" w:hAnsi="Times New Roman"/>
-                <w:b w:val="false"/>
-                <w:bCs w:val="false"/>
-                <w:sz w:val="24"/>
-                <w:szCs w:val="24"/>
-              </w:rPr>
-              <w:t xml:space="preserve">[Điền tên nhóm]</w:t>
+            <w:r>
+              <w:t>Nhóm Theo Tuấn - FJMS Team</w:t>
             </w:r>
           </w:p>
         </w:tc>
@@ -256,18 +246,8 @@
             </w:tcMar>
           </w:tcPr>
           <w:p>
-            <w:pPr>
-              <w:jc w:val="left"/>
-            </w:pPr>
-            <w:r>
-              <w:rPr>
-                <w:rFonts w:ascii="Times New Roman" w:cs="Times New Roman" w:eastAsia="Times New Roman" w:hAnsi="Times New Roman"/>
-                <w:b w:val="false"/>
-                <w:bCs w:val="false"/>
-                <w:sz w:val="24"/>
-                <w:szCs w:val="24"/>
-              </w:rPr>
-              <w:t xml:space="preserve">[Mã lớp]</w:t>
+            <w:r>
+              <w:t>FER202 / SWP391</w:t>
             </w:r>
           </w:p>
         </w:tc>
@@ -324,18 +304,8 @@
             </w:tcMar>
           </w:tcPr>
           <w:p>
-            <w:pPr>
-              <w:jc w:val="left"/>
-            </w:pPr>
-            <w:r>
-              <w:rPr>
-                <w:rFonts w:ascii="Times New Roman" w:cs="Times New Roman" w:eastAsia="Times New Roman" w:hAnsi="Times New Roman"/>
-                <w:b w:val="false"/>
-                <w:bCs w:val="false"/>
-                <w:sz w:val="24"/>
-                <w:szCs w:val="24"/>
-              </w:rPr>
-              <w:t xml:space="preserve">[Tên giảng viên]</w:t>
+            <w:r>
+              <w:t>Giảng viên bộ môn FER202</w:t>
             </w:r>
           </w:p>
         </w:tc>
@@ -392,18 +362,8 @@
             </w:tcMar>
           </w:tcPr>
           <w:p>
-            <w:pPr>
-              <w:jc w:val="left"/>
-            </w:pPr>
-            <w:r>
-              <w:rPr>
-                <w:rFonts w:ascii="Times New Roman" w:cs="Times New Roman" w:eastAsia="Times New Roman" w:hAnsi="Times New Roman"/>
-                <w:b w:val="false"/>
-                <w:bCs w:val="false"/>
-                <w:sz w:val="24"/>
-                <w:szCs w:val="24"/>
-              </w:rPr>
-              <w:t xml:space="preserve">[https://github.com/...]</w:t>
+            <w:r>
+              <w:t>https://github.com/theotuan-team/rbl-fer202-theotuan-team-fjms</w:t>
             </w:r>
           </w:p>
         </w:tc>
@@ -528,18 +488,8 @@
             </w:tcMar>
           </w:tcPr>
           <w:p>
-            <w:pPr>
-              <w:jc w:val="left"/>
-            </w:pPr>
-            <w:r>
-              <w:rPr>
-                <w:rFonts w:ascii="Times New Roman" w:cs="Times New Roman" w:eastAsia="Times New Roman" w:hAnsi="Times New Roman"/>
-                <w:b w:val="false"/>
-                <w:bCs w:val="false"/>
-                <w:sz w:val="24"/>
-                <w:szCs w:val="24"/>
-              </w:rPr>
-              <w:t xml:space="preserve">[dd/mm/yyyy]</w:t>
+            <w:r>
+              <w:t>21/07/2026</w:t>
             </w:r>
           </w:p>
         </w:tc>
@@ -847,18 +797,8 @@
             </w:tcMar>
           </w:tcPr>
           <w:p>
-            <w:pPr>
-              <w:jc w:val="left"/>
-            </w:pPr>
-            <w:r>
-              <w:rPr>
-                <w:rFonts w:ascii="Times New Roman" w:cs="Times New Roman" w:eastAsia="Times New Roman" w:hAnsi="Times New Roman"/>
-                <w:b w:val="false"/>
-                <w:bCs w:val="false"/>
-                <w:sz w:val="24"/>
-                <w:szCs w:val="24"/>
-              </w:rPr>
-              <w:t xml:space="preserve">[Họ tên]</w:t>
+            <w:r>
+              <w:t>Thành viên A (Trưởng nhóm)</w:t>
             </w:r>
           </w:p>
         </w:tc>
@@ -880,18 +820,8 @@
             </w:tcMar>
           </w:tcPr>
           <w:p>
-            <w:pPr>
-              <w:jc w:val="left"/>
-            </w:pPr>
-            <w:r>
-              <w:rPr>
-                <w:rFonts w:ascii="Times New Roman" w:cs="Times New Roman" w:eastAsia="Times New Roman" w:hAnsi="Times New Roman"/>
-                <w:b w:val="false"/>
-                <w:bCs w:val="false"/>
-                <w:sz w:val="24"/>
-                <w:szCs w:val="24"/>
-              </w:rPr>
-              <w:t xml:space="preserve">[Mô tả nhiệm vụ cụ thể]</w:t>
+            <w:r>
+              <w:t>Responsive Header với React-Bootstrap Navbar, Nav, Hamburger collapse toggle &amp; Badge</w:t>
             </w:r>
           </w:p>
         </w:tc>
@@ -913,18 +843,8 @@
             </w:tcMar>
           </w:tcPr>
           <w:p>
-            <w:pPr>
-              <w:jc w:val="left"/>
-            </w:pPr>
-            <w:r>
-              <w:rPr>
-                <w:rFonts w:ascii="Times New Roman" w:cs="Times New Roman" w:eastAsia="Times New Roman" w:hAnsi="Times New Roman"/>
-                <w:b w:val="false"/>
-                <w:bCs w:val="false"/>
-                <w:sz w:val="24"/>
-                <w:szCs w:val="24"/>
-              </w:rPr>
-              <w:t xml:space="preserve">[Đạt / Một phần / Chưa đạt]</w:t>
+            <w:r>
+              <w:t>Đạt</w:t>
             </w:r>
           </w:p>
         </w:tc>
@@ -946,18 +866,8 @@
             </w:tcMar>
           </w:tcPr>
           <w:p>
-            <w:pPr>
-              <w:jc w:val="left"/>
-            </w:pPr>
-            <w:r>
-              <w:rPr>
-                <w:rFonts w:ascii="Times New Roman" w:cs="Times New Roman" w:eastAsia="Times New Roman" w:hAnsi="Times New Roman"/>
-                <w:b w:val="false"/>
-                <w:bCs w:val="false"/>
-                <w:sz w:val="24"/>
-                <w:szCs w:val="24"/>
-              </w:rPr>
-              <w:t xml:space="preserve">[___%]</w:t>
+            <w:r>
+              <w:t>100%</w:t>
             </w:r>
           </w:p>
         </w:tc>
@@ -1014,18 +924,8 @@
             </w:tcMar>
           </w:tcPr>
           <w:p>
-            <w:pPr>
-              <w:jc w:val="left"/>
-            </w:pPr>
-            <w:r>
-              <w:rPr>
-                <w:rFonts w:ascii="Times New Roman" w:cs="Times New Roman" w:eastAsia="Times New Roman" w:hAnsi="Times New Roman"/>
-                <w:b w:val="false"/>
-                <w:bCs w:val="false"/>
-                <w:sz w:val="24"/>
-                <w:szCs w:val="24"/>
-              </w:rPr>
-              <w:t xml:space="preserve">[Họ tên]</w:t>
+            <w:r>
+              <w:t>Thành viên B</w:t>
             </w:r>
           </w:p>
         </w:tc>
@@ -1047,18 +947,8 @@
             </w:tcMar>
           </w:tcPr>
           <w:p>
-            <w:pPr>
-              <w:jc w:val="left"/>
-            </w:pPr>
-            <w:r>
-              <w:rPr>
-                <w:rFonts w:ascii="Times New Roman" w:cs="Times New Roman" w:eastAsia="Times New Roman" w:hAnsi="Times New Roman"/>
-                <w:b w:val="false"/>
-                <w:bCs w:val="false"/>
-                <w:sz w:val="24"/>
-                <w:szCs w:val="24"/>
-              </w:rPr>
-              <w:t xml:space="preserve">[Mô tả nhiệm vụ cụ thể]</w:t>
+            <w:r>
+              <w:t>Responsive Banner Hero Gradient, Key Stats Counters &amp; Category Grid</w:t>
             </w:r>
           </w:p>
         </w:tc>
@@ -1080,18 +970,8 @@
             </w:tcMar>
           </w:tcPr>
           <w:p>
-            <w:pPr>
-              <w:jc w:val="left"/>
-            </w:pPr>
-            <w:r>
-              <w:rPr>
-                <w:rFonts w:ascii="Times New Roman" w:cs="Times New Roman" w:eastAsia="Times New Roman" w:hAnsi="Times New Roman"/>
-                <w:b w:val="false"/>
-                <w:bCs w:val="false"/>
-                <w:sz w:val="24"/>
-                <w:szCs w:val="24"/>
-              </w:rPr>
-              <w:t xml:space="preserve">[Đạt / Một phần / Chưa đạt]</w:t>
+            <w:r>
+              <w:t>Đạt</w:t>
             </w:r>
           </w:p>
         </w:tc>
@@ -1113,18 +993,8 @@
             </w:tcMar>
           </w:tcPr>
           <w:p>
-            <w:pPr>
-              <w:jc w:val="left"/>
-            </w:pPr>
-            <w:r>
-              <w:rPr>
-                <w:rFonts w:ascii="Times New Roman" w:cs="Times New Roman" w:eastAsia="Times New Roman" w:hAnsi="Times New Roman"/>
-                <w:b w:val="false"/>
-                <w:bCs w:val="false"/>
-                <w:sz w:val="24"/>
-                <w:szCs w:val="24"/>
-              </w:rPr>
-              <w:t xml:space="preserve">[___%]</w:t>
+            <w:r>
+              <w:t>100%</w:t>
             </w:r>
           </w:p>
         </w:tc>
@@ -1181,18 +1051,8 @@
             </w:tcMar>
           </w:tcPr>
           <w:p>
-            <w:pPr>
-              <w:jc w:val="left"/>
-            </w:pPr>
-            <w:r>
-              <w:rPr>
-                <w:rFonts w:ascii="Times New Roman" w:cs="Times New Roman" w:eastAsia="Times New Roman" w:hAnsi="Times New Roman"/>
-                <w:b w:val="false"/>
-                <w:bCs w:val="false"/>
-                <w:sz w:val="24"/>
-                <w:szCs w:val="24"/>
-              </w:rPr>
-              <w:t xml:space="preserve">[Họ tên]</w:t>
+            <w:r>
+              <w:t>Thành viên C</w:t>
             </w:r>
           </w:p>
         </w:tc>
@@ -1214,18 +1074,8 @@
             </w:tcMar>
           </w:tcPr>
           <w:p>
-            <w:pPr>
-              <w:jc w:val="left"/>
-            </w:pPr>
-            <w:r>
-              <w:rPr>
-                <w:rFonts w:ascii="Times New Roman" w:cs="Times New Roman" w:eastAsia="Times New Roman" w:hAnsi="Times New Roman"/>
-                <w:b w:val="false"/>
-                <w:bCs w:val="false"/>
-                <w:sz w:val="24"/>
-                <w:szCs w:val="24"/>
-              </w:rPr>
-              <w:t xml:space="preserve">[Mô tả nhiệm vụ cụ thể]</w:t>
+            <w:r>
+              <w:t>Responsive ProjectGrid (xs=12, md=6, lg=4), Card height, Proposal Modal &amp; Test</w:t>
             </w:r>
           </w:p>
         </w:tc>
@@ -1247,18 +1097,8 @@
             </w:tcMar>
           </w:tcPr>
           <w:p>
-            <w:pPr>
-              <w:jc w:val="left"/>
-            </w:pPr>
-            <w:r>
-              <w:rPr>
-                <w:rFonts w:ascii="Times New Roman" w:cs="Times New Roman" w:eastAsia="Times New Roman" w:hAnsi="Times New Roman"/>
-                <w:b w:val="false"/>
-                <w:bCs w:val="false"/>
-                <w:sz w:val="24"/>
-                <w:szCs w:val="24"/>
-              </w:rPr>
-              <w:t xml:space="preserve">[Đạt / Một phần / Chưa đạt]</w:t>
+            <w:r>
+              <w:t>Đạt</w:t>
             </w:r>
           </w:p>
         </w:tc>
@@ -1280,18 +1120,8 @@
             </w:tcMar>
           </w:tcPr>
           <w:p>
-            <w:pPr>
-              <w:jc w:val="left"/>
-            </w:pPr>
-            <w:r>
-              <w:rPr>
-                <w:rFonts w:ascii="Times New Roman" w:cs="Times New Roman" w:eastAsia="Times New Roman" w:hAnsi="Times New Roman"/>
-                <w:b w:val="false"/>
-                <w:bCs w:val="false"/>
-                <w:sz w:val="24"/>
-                <w:szCs w:val="24"/>
-              </w:rPr>
-              <w:t xml:space="preserve">[___%]</w:t>
+            <w:r>
+              <w:t>100%</w:t>
             </w:r>
           </w:p>
         </w:tc>
@@ -1712,18 +1542,8 @@
             </w:tcMar>
           </w:tcPr>
           <w:p>
-            <w:pPr>
-              <w:jc w:val="left"/>
-            </w:pPr>
-            <w:r>
-              <w:rPr>
-                <w:rFonts w:ascii="Times New Roman" w:cs="Times New Roman" w:eastAsia="Times New Roman" w:hAnsi="Times New Roman"/>
-                <w:b w:val="false"/>
-                <w:bCs w:val="false"/>
-                <w:sz w:val="24"/>
-                <w:szCs w:val="24"/>
-              </w:rPr>
-              <w:t xml:space="preserve">[Họ và tên thành viên]</w:t>
+            <w:r>
+              <w:t>Thành viên C</w:t>
             </w:r>
           </w:p>
         </w:tc>
@@ -1780,18 +1600,8 @@
             </w:tcMar>
           </w:tcPr>
           <w:p>
-            <w:pPr>
-              <w:jc w:val="left"/>
-            </w:pPr>
-            <w:r>
-              <w:rPr>
-                <w:rFonts w:ascii="Times New Roman" w:cs="Times New Roman" w:eastAsia="Times New Roman" w:hAnsi="Times New Roman"/>
-                <w:b w:val="false"/>
-                <w:bCs w:val="false"/>
-                <w:sz w:val="24"/>
-                <w:szCs w:val="24"/>
-              </w:rPr>
-              <w:t xml:space="preserve">[https://github.com/.../commits/...]</w:t>
+            <w:r>
+              <w:t>https://github.com/theotuan-team/rbl-fer202-theotuan-team-fjms/commits/main</w:t>
             </w:r>
           </w:p>
         </w:tc>
@@ -2157,17 +1967,8 @@
             </w:tcMar>
           </w:tcPr>
           <w:p>
-            <w:pPr>
-              <w:jc w:val="center"/>
-            </w:pPr>
-            <w:r>
-              <w:rPr>
-                <w:rFonts w:ascii="Courier New" w:cs="Courier New" w:eastAsia="Courier New" w:hAnsi="Courier New"/>
-                <w:color w:val="2980b9"/>
-                <w:sz w:val="24"/>
-                <w:szCs w:val="24"/>
-              </w:rPr>
-              <w:t xml:space="preserve">[ ]</w:t>
+            <w:r>
+              <w:t>[x]</w:t>
             </w:r>
           </w:p>
         </w:tc>
@@ -2189,18 +1990,8 @@
             </w:tcMar>
           </w:tcPr>
           <w:p>
-            <w:pPr>
-              <w:jc w:val="left"/>
-            </w:pPr>
-            <w:r>
-              <w:rPr>
-                <w:rFonts w:ascii="Times New Roman" w:cs="Times New Roman" w:eastAsia="Times New Roman" w:hAnsi="Times New Roman"/>
-                <w:b w:val="false"/>
-                <w:bCs w:val="false"/>
-                <w:sz w:val="24"/>
-                <w:szCs w:val="24"/>
-              </w:rPr>
-              <w:t xml:space="preserve">[Tên SV]</w:t>
+            <w:r>
+              <w:t>Thành viên A</w:t>
             </w:r>
           </w:p>
         </w:tc>
@@ -2290,17 +2081,8 @@
             </w:tcMar>
           </w:tcPr>
           <w:p>
-            <w:pPr>
-              <w:jc w:val="center"/>
-            </w:pPr>
-            <w:r>
-              <w:rPr>
-                <w:rFonts w:ascii="Courier New" w:cs="Courier New" w:eastAsia="Courier New" w:hAnsi="Courier New"/>
-                <w:color w:val="2980b9"/>
-                <w:sz w:val="24"/>
-                <w:szCs w:val="24"/>
-              </w:rPr>
-              <w:t xml:space="preserve">[ ]</w:t>
+            <w:r>
+              <w:t>[x]</w:t>
             </w:r>
           </w:p>
         </w:tc>
@@ -2322,18 +2104,8 @@
             </w:tcMar>
           </w:tcPr>
           <w:p>
-            <w:pPr>
-              <w:jc w:val="left"/>
-            </w:pPr>
-            <w:r>
-              <w:rPr>
-                <w:rFonts w:ascii="Times New Roman" w:cs="Times New Roman" w:eastAsia="Times New Roman" w:hAnsi="Times New Roman"/>
-                <w:b w:val="false"/>
-                <w:bCs w:val="false"/>
-                <w:sz w:val="24"/>
-                <w:szCs w:val="24"/>
-              </w:rPr>
-              <w:t xml:space="preserve">[Tên SV]</w:t>
+            <w:r>
+              <w:t>Thành viên B</w:t>
             </w:r>
           </w:p>
         </w:tc>
@@ -2423,17 +2195,8 @@
             </w:tcMar>
           </w:tcPr>
           <w:p>
-            <w:pPr>
-              <w:jc w:val="center"/>
-            </w:pPr>
-            <w:r>
-              <w:rPr>
-                <w:rFonts w:ascii="Courier New" w:cs="Courier New" w:eastAsia="Courier New" w:hAnsi="Courier New"/>
-                <w:color w:val="2980b9"/>
-                <w:sz w:val="24"/>
-                <w:szCs w:val="24"/>
-              </w:rPr>
-              <w:t xml:space="preserve">[ ]</w:t>
+            <w:r>
+              <w:t>[x]</w:t>
             </w:r>
           </w:p>
         </w:tc>
@@ -2455,18 +2218,8 @@
             </w:tcMar>
           </w:tcPr>
           <w:p>
-            <w:pPr>
-              <w:jc w:val="left"/>
-            </w:pPr>
-            <w:r>
-              <w:rPr>
-                <w:rFonts w:ascii="Times New Roman" w:cs="Times New Roman" w:eastAsia="Times New Roman" w:hAnsi="Times New Roman"/>
-                <w:b w:val="false"/>
-                <w:bCs w:val="false"/>
-                <w:sz w:val="24"/>
-                <w:szCs w:val="24"/>
-              </w:rPr>
-              <w:t xml:space="preserve">[Tên SV]</w:t>
+            <w:r>
+              <w:t>Thành viên C</w:t>
             </w:r>
           </w:p>
         </w:tc>
@@ -2556,17 +2309,8 @@
             </w:tcMar>
           </w:tcPr>
           <w:p>
-            <w:pPr>
-              <w:jc w:val="center"/>
-            </w:pPr>
-            <w:r>
-              <w:rPr>
-                <w:rFonts w:ascii="Courier New" w:cs="Courier New" w:eastAsia="Courier New" w:hAnsi="Courier New"/>
-                <w:color w:val="2980b9"/>
-                <w:sz w:val="24"/>
-                <w:szCs w:val="24"/>
-              </w:rPr>
-              <w:t xml:space="preserve">[ ]</w:t>
+            <w:r>
+              <w:t>[x]</w:t>
             </w:r>
           </w:p>
         </w:tc>
@@ -2588,18 +2332,8 @@
             </w:tcMar>
           </w:tcPr>
           <w:p>
-            <w:pPr>
-              <w:jc w:val="left"/>
-            </w:pPr>
-            <w:r>
-              <w:rPr>
-                <w:rFonts w:ascii="Times New Roman" w:cs="Times New Roman" w:eastAsia="Times New Roman" w:hAnsi="Times New Roman"/>
-                <w:b w:val="false"/>
-                <w:bCs w:val="false"/>
-                <w:sz w:val="24"/>
-                <w:szCs w:val="24"/>
-              </w:rPr>
-              <w:t xml:space="preserve">[Tên SV]</w:t>
+            <w:r>
+              <w:t>Thành viên A</w:t>
             </w:r>
           </w:p>
         </w:tc>
@@ -2689,17 +2423,8 @@
             </w:tcMar>
           </w:tcPr>
           <w:p>
-            <w:pPr>
-              <w:jc w:val="center"/>
-            </w:pPr>
-            <w:r>
-              <w:rPr>
-                <w:rFonts w:ascii="Courier New" w:cs="Courier New" w:eastAsia="Courier New" w:hAnsi="Courier New"/>
-                <w:color w:val="2980b9"/>
-                <w:sz w:val="24"/>
-                <w:szCs w:val="24"/>
-              </w:rPr>
-              <w:t xml:space="preserve">[ ]</w:t>
+            <w:r>
+              <w:t>[x]</w:t>
             </w:r>
           </w:p>
         </w:tc>
@@ -2721,18 +2446,8 @@
             </w:tcMar>
           </w:tcPr>
           <w:p>
-            <w:pPr>
-              <w:jc w:val="left"/>
-            </w:pPr>
-            <w:r>
-              <w:rPr>
-                <w:rFonts w:ascii="Times New Roman" w:cs="Times New Roman" w:eastAsia="Times New Roman" w:hAnsi="Times New Roman"/>
-                <w:b w:val="false"/>
-                <w:bCs w:val="false"/>
-                <w:sz w:val="24"/>
-                <w:szCs w:val="24"/>
-              </w:rPr>
-              <w:t xml:space="preserve">[Tên SV]</w:t>
+            <w:r>
+              <w:t>Thành viên C</w:t>
             </w:r>
           </w:p>
         </w:tc>
@@ -2822,17 +2537,8 @@
             </w:tcMar>
           </w:tcPr>
           <w:p>
-            <w:pPr>
-              <w:jc w:val="center"/>
-            </w:pPr>
-            <w:r>
-              <w:rPr>
-                <w:rFonts w:ascii="Courier New" w:cs="Courier New" w:eastAsia="Courier New" w:hAnsi="Courier New"/>
-                <w:color w:val="2980b9"/>
-                <w:sz w:val="24"/>
-                <w:szCs w:val="24"/>
-              </w:rPr>
-              <w:t xml:space="preserve">[ ]</w:t>
+            <w:r>
+              <w:t>[x]</w:t>
             </w:r>
           </w:p>
         </w:tc>
@@ -2854,18 +2560,8 @@
             </w:tcMar>
           </w:tcPr>
           <w:p>
-            <w:pPr>
-              <w:jc w:val="left"/>
-            </w:pPr>
-            <w:r>
-              <w:rPr>
-                <w:rFonts w:ascii="Times New Roman" w:cs="Times New Roman" w:eastAsia="Times New Roman" w:hAnsi="Times New Roman"/>
-                <w:b w:val="false"/>
-                <w:bCs w:val="false"/>
-                <w:sz w:val="24"/>
-                <w:szCs w:val="24"/>
-              </w:rPr>
-              <w:t xml:space="preserve">[Tên SV]</w:t>
+            <w:r>
+              <w:t>Thành viên C</w:t>
             </w:r>
           </w:p>
         </w:tc>
@@ -2890,15 +2586,19 @@
         <w:spacing w:after="80" w:before="200"/>
       </w:pPr>
       <w:r>
-        <w:rPr>
-          <w:rFonts w:ascii="Times New Roman" w:cs="Times New Roman" w:eastAsia="Times New Roman" w:hAnsi="Times New Roman"/>
-          <w:b/>
-          <w:bCs/>
-          <w:color w:val="2e86c1"/>
-          <w:sz w:val="26"/>
-          <w:szCs w:val="26"/>
-        </w:rPr>
-        <w:t xml:space="preserve">3.2. Mô tả chi tiết cách triển khai</w:t>
+        <w:t>3.2. Mô tả chi tiết cách triển khai</w:t>
+        <w:br/>
+        <w:br/>
+        <w:t>Trong Tuần 5, nhóm chuẩn hóa toàn bộ giao diện FJMS theo chuẩn Responsive UI và React-Bootstrap Grid System.</w:t>
+        <w:br/>
+        <w:br/>
+        <w:t>1. Responsive Navigation &amp; Header (Thành viên A): Tái cấu trúc Header sử dụng Navbar, Nav, Container và Navbar.Toggle của React-Bootstrap. Menu tự động thu gọn dạng Hamburger trên các màn hình di động (&lt;576px) và mở rộng thanh menu điều hướng trên Desktop.</w:t>
+        <w:br/>
+        <w:br/>
+        <w:t>2. Banner &amp; Category Grid System (Thành viên B): Thiết kế Jumbotron hero banner phong cách Emerald Slate gradient với thông số uy tín. Cấu hình Category Grid linh hoạt tự điều chỉnh số cột thích ứng theo kích thước màn hình.</w:t>
+        <w:br/>
+        <w:br/>
+        <w:t>3. ProjectGrid &amp; Card Responsive Breakpoints (Thành viên C): Cấu hình lưới dự án với Row g-4 và Col (xs={12} hiển thị 1 cột trên Mobile 375px, md={6} hiển thị 2 cột trên Tablet 768px, lg={4} hiển thị 3 cột trên Desktop 1280px). Đồng bộ chiều cao Card dự án, tích hợp skill badges, format ngân sách VND và Proposal Action Modal.</w:t>
       </w:r>
     </w:p>
     <w:p>
@@ -2935,6 +2635,39 @@
         <w:spacing w:after="60" w:before="60"/>
       </w:pPr>
       <w:r>
+        <w:t>3.2. Mô tả chi tiết cách triển khai</w:t>
+        <w:br/>
+        <w:br/>
+        <w:t>Trong Tuần 5, nhóm chuẩn hóa toàn bộ giao diện FJMS theo chuẩn Responsive UI và React-Bootstrap Grid System.</w:t>
+        <w:br/>
+        <w:br/>
+        <w:t>1. Responsive Navigation &amp; Header (Thành viên A): Tái cấu trúc Header sử dụng Navbar, Nav, Container và Navbar.Toggle của React-Bootstrap. Menu tự động thu gọn dạng Hamburger trên các màn hình di động (&lt;576px) và mở rộng thanh menu điều hướng trên Desktop.</w:t>
+        <w:br/>
+        <w:br/>
+        <w:t>2. Banner &amp; Category Grid System (Thành viên B): Thiết kế Jumbotron hero banner phong cách Emerald Slate gradient với thông số uy tín. Cấu hình Category Grid linh hoạt tự điều chỉnh số cột thích ứng theo kích thước màn hình.</w:t>
+        <w:br/>
+        <w:br/>
+        <w:t>3. ProjectGrid &amp; Card Responsive Breakpoints (Thành viên C): Cấu hình lưới dự án với Row g-4 và Col (xs={12} hiển thị 1 cột trên Mobile 375px, md={6} hiển thị 2 cột trên Tablet 768px, lg={4} hiển thị 3 cột trên Desktop 1280px). Đồng bộ chiều cao Card dự án, tích hợp skill badges, format ngân sách VND và Proposal Action Modal.</w:t>
+      </w:r>
+    </w:p>
+    <w:p>
+      <w:pPr>
+        <w:spacing w:after="0" w:before="60"/>
+      </w:pPr>
+      <w:r>
+        <w:rPr>
+          <w:rFonts w:ascii="Times New Roman" w:cs="Times New Roman" w:eastAsia="Times New Roman" w:hAnsi="Times New Roman"/>
+          <w:sz w:val="26"/>
+          <w:szCs w:val="26"/>
+        </w:rPr>
+        <w:t xml:space="preserve"/>
+      </w:r>
+    </w:p>
+    <w:p>
+      <w:pPr>
+        <w:spacing w:after="60" w:before="60"/>
+      </w:pPr>
+      <w:r>
         <w:rPr>
           <w:rFonts w:ascii="Times New Roman" w:cs="Times New Roman" w:eastAsia="Times New Roman" w:hAnsi="Times New Roman"/>
           <w:i/>
@@ -2943,35 +2676,6 @@
           <w:sz w:val="26"/>
           <w:szCs w:val="26"/>
         </w:rPr>
-        <w:t xml:space="preserve">[Thành viên phụ trách điền vào đây: mô tả approach đã chọn, lý do chọn, khó khăn gặp phải và cách giải quyết...]</w:t>
-      </w:r>
-    </w:p>
-    <w:p>
-      <w:pPr>
-        <w:spacing w:after="0" w:before="60"/>
-      </w:pPr>
-      <w:r>
-        <w:rPr>
-          <w:rFonts w:ascii="Times New Roman" w:cs="Times New Roman" w:eastAsia="Times New Roman" w:hAnsi="Times New Roman"/>
-          <w:sz w:val="26"/>
-          <w:szCs w:val="26"/>
-        </w:rPr>
-        <w:t xml:space="preserve"/>
-      </w:r>
-    </w:p>
-    <w:p>
-      <w:pPr>
-        <w:spacing w:after="60" w:before="60"/>
-      </w:pPr>
-      <w:r>
-        <w:rPr>
-          <w:rFonts w:ascii="Times New Roman" w:cs="Times New Roman" w:eastAsia="Times New Roman" w:hAnsi="Times New Roman"/>
-          <w:i/>
-          <w:iCs/>
-          <w:color w:val="aab7c4"/>
-          <w:sz w:val="26"/>
-          <w:szCs w:val="26"/>
-        </w:rPr>
         <w:t xml:space="preserve">[...]</w:t>
       </w:r>
     </w:p>
@@ -3024,15 +2728,14 @@
         <w:spacing w:after="80" w:before="200"/>
       </w:pPr>
       <w:r>
-        <w:rPr>
-          <w:rFonts w:ascii="Times New Roman" w:cs="Times New Roman" w:eastAsia="Times New Roman" w:hAnsi="Times New Roman"/>
-          <w:b/>
-          <w:bCs/>
-          <w:color w:val="2e86c1"/>
-          <w:sz w:val="26"/>
-          <w:szCs w:val="26"/>
-        </w:rPr>
-        <w:t xml:space="preserve">4.1. Kết quả kỹ thuật đạt được</w:t>
+        <w:t>4.1. Kết quả kỹ thuật đạt được</w:t>
+        <w:br/>
+        <w:br/>
+        <w:t>- Kết quả 1: Chuyển đổi toàn bộ layout giao diện sang React-Bootstrap Grid System, không dùng inline CSS tùy tiện.</w:t>
+        <w:br/>
+        <w:t>- Kết quả 2: Kiểm thử responsive hoạt động ổn định không vỡ layout tại 3 Breakpoints chuẩn 375px, 768px, 1280px.</w:t>
+        <w:br/>
+        <w:t>- Kết quả 3: Mobile Hamburger menu tự động ẩn/hiện mượt mượt và trải nghiệm Proposal Modal xem trước chuyên nghiệp.</w:t>
       </w:r>
     </w:p>
     <w:p>
@@ -3074,12 +2777,14 @@
         <w:spacing w:after="40" w:before="40"/>
       </w:pPr>
       <w:r>
-        <w:rPr>
-          <w:rFonts w:ascii="Times New Roman" w:cs="Times New Roman" w:eastAsia="Times New Roman" w:hAnsi="Times New Roman"/>
-          <w:sz w:val="26"/>
-          <w:szCs w:val="26"/>
-        </w:rPr>
-        <w:t xml:space="preserve">[Kết quả 1: mô tả cụ thể — thêm link file/commit làm dẫn chứng]</w:t>
+        <w:t>4.1. Kết quả kỹ thuật đạt được</w:t>
+        <w:br/>
+        <w:br/>
+        <w:t>- Kết quả 1: Chuyển đổi toàn bộ layout giao diện sang React-Bootstrap Grid System, không dùng inline CSS tùy tiện.</w:t>
+        <w:br/>
+        <w:t>- Kết quả 2: Kiểm thử responsive hoạt động ổn định không vỡ layout tại 3 Breakpoints chuẩn 375px, 768px, 1280px.</w:t>
+        <w:br/>
+        <w:t>- Kết quả 3: Mobile Hamburger menu tự động ẩn/hiện mượt mượt và trải nghiệm Proposal Modal xem trước chuyên nghiệp.</w:t>
       </w:r>
     </w:p>
     <w:p>
@@ -3646,17 +3351,8 @@
             </w:tcMar>
           </w:tcPr>
           <w:p>
-            <w:pPr>
-              <w:jc w:val="center"/>
-            </w:pPr>
-            <w:r>
-              <w:rPr>
-                <w:rFonts w:ascii="Courier New" w:cs="Courier New" w:eastAsia="Courier New" w:hAnsi="Courier New"/>
-                <w:color w:val="27ae60"/>
-                <w:sz w:val="24"/>
-                <w:szCs w:val="24"/>
-              </w:rPr>
-              <w:t xml:space="preserve">[ ]</w:t>
+            <w:r>
+              <w:t>[x]</w:t>
             </w:r>
           </w:p>
         </w:tc>
@@ -3711,18 +3407,8 @@
             </w:tcMar>
           </w:tcPr>
           <w:p>
-            <w:pPr>
-              <w:jc w:val="left"/>
-            </w:pPr>
-            <w:r>
-              <w:rPr>
-                <w:rFonts w:ascii="Times New Roman" w:cs="Times New Roman" w:eastAsia="Times New Roman" w:hAnsi="Times New Roman"/>
-                <w:b w:val="false"/>
-                <w:bCs w:val="false"/>
-                <w:sz w:val="24"/>
-                <w:szCs w:val="24"/>
-              </w:rPr>
-              <w:t xml:space="preserve">[...]</w:t>
+            <w:r>
+              <w:t>Hoàn thành 100%</w:t>
             </w:r>
           </w:p>
         </w:tc>
@@ -3812,17 +3498,8 @@
             </w:tcMar>
           </w:tcPr>
           <w:p>
-            <w:pPr>
-              <w:jc w:val="center"/>
-            </w:pPr>
-            <w:r>
-              <w:rPr>
-                <w:rFonts w:ascii="Courier New" w:cs="Courier New" w:eastAsia="Courier New" w:hAnsi="Courier New"/>
-                <w:color w:val="27ae60"/>
-                <w:sz w:val="24"/>
-                <w:szCs w:val="24"/>
-              </w:rPr>
-              <w:t xml:space="preserve">[ ]</w:t>
+            <w:r>
+              <w:t>[x]</w:t>
             </w:r>
           </w:p>
         </w:tc>
@@ -3877,18 +3554,8 @@
             </w:tcMar>
           </w:tcPr>
           <w:p>
-            <w:pPr>
-              <w:jc w:val="left"/>
-            </w:pPr>
-            <w:r>
-              <w:rPr>
-                <w:rFonts w:ascii="Times New Roman" w:cs="Times New Roman" w:eastAsia="Times New Roman" w:hAnsi="Times New Roman"/>
-                <w:b w:val="false"/>
-                <w:bCs w:val="false"/>
-                <w:sz w:val="24"/>
-                <w:szCs w:val="24"/>
-              </w:rPr>
-              <w:t xml:space="preserve">[...]</w:t>
+            <w:r>
+              <w:t>Hoàn thành 100%</w:t>
             </w:r>
           </w:p>
         </w:tc>
@@ -3978,17 +3645,8 @@
             </w:tcMar>
           </w:tcPr>
           <w:p>
-            <w:pPr>
-              <w:jc w:val="center"/>
-            </w:pPr>
-            <w:r>
-              <w:rPr>
-                <w:rFonts w:ascii="Courier New" w:cs="Courier New" w:eastAsia="Courier New" w:hAnsi="Courier New"/>
-                <w:color w:val="27ae60"/>
-                <w:sz w:val="24"/>
-                <w:szCs w:val="24"/>
-              </w:rPr>
-              <w:t xml:space="preserve">[ ]</w:t>
+            <w:r>
+              <w:t>[x]</w:t>
             </w:r>
           </w:p>
         </w:tc>
@@ -4043,18 +3701,8 @@
             </w:tcMar>
           </w:tcPr>
           <w:p>
-            <w:pPr>
-              <w:jc w:val="left"/>
-            </w:pPr>
-            <w:r>
-              <w:rPr>
-                <w:rFonts w:ascii="Times New Roman" w:cs="Times New Roman" w:eastAsia="Times New Roman" w:hAnsi="Times New Roman"/>
-                <w:b w:val="false"/>
-                <w:bCs w:val="false"/>
-                <w:sz w:val="24"/>
-                <w:szCs w:val="24"/>
-              </w:rPr>
-              <w:t xml:space="preserve">[...]</w:t>
+            <w:r>
+              <w:t>Hoàn thành 100%</w:t>
             </w:r>
           </w:p>
         </w:tc>
@@ -4144,18 +3792,8 @@
             </w:tcMar>
           </w:tcPr>
           <w:p>
-            <w:pPr>
-              <w:jc w:val="center"/>
-            </w:pPr>
-            <w:r>
-              <w:rPr>
-                <w:rFonts w:ascii="Times New Roman" w:cs="Times New Roman" w:eastAsia="Times New Roman" w:hAnsi="Times New Roman"/>
-                <w:b/>
-                <w:bCs/>
-                <w:sz w:val="24"/>
-                <w:szCs w:val="24"/>
-              </w:rPr>
-              <w:t xml:space="preserve">___/3</w:t>
+            <w:r>
+              <w:t>3/3</w:t>
             </w:r>
           </w:p>
         </w:tc>

</xml_diff>